<commit_message>
Actualizacion formatos e imagen bomberos
</commit_message>
<xml_diff>
--- a/Inputs/Templates/GRI UVP.docx
+++ b/Inputs/Templates/GRI UVP.docx
@@ -485,7 +485,7 @@
           <w:sz w:val="24"/>
           <w:szCs w:val="24"/>
         </w:rPr>
-        <w:t xml:space="preserve"> TURNOS</w:t>
+        <w:t xml:space="preserve"> TURNO</w:t>
       </w:r>
     </w:p>
     <w:p>
@@ -583,37 +583,12 @@
       <w:r>
         <w:t xml:space="preserve"> </w:t>
       </w:r>
-      <w:proofErr w:type="gramStart"/>
       <w:r>
         <w:rPr>
           <w:b/>
           <w:bCs/>
         </w:rPr>
-        <w:t>{{ turno</w:t>
-      </w:r>
-      <w:proofErr w:type="gramEnd"/>
-      <w:r>
-        <w:rPr>
-          <w:b/>
-          <w:bCs/>
-        </w:rPr>
-        <w:t>_</w:t>
-      </w:r>
-      <w:proofErr w:type="gramStart"/>
-      <w:r>
-        <w:rPr>
-          <w:b/>
-          <w:bCs/>
-        </w:rPr>
-        <w:t>2 }</w:t>
-      </w:r>
-      <w:proofErr w:type="gramEnd"/>
-      <w:r>
-        <w:rPr>
-          <w:b/>
-          <w:bCs/>
-        </w:rPr>
-        <w:t>}</w:t>
+        <w:t>***</w:t>
       </w:r>
       <w:r>
         <w:rPr>
@@ -653,37 +628,12 @@
       <w:r>
         <w:t xml:space="preserve">En el tercer turno se tienen </w:t>
       </w:r>
-      <w:proofErr w:type="gramStart"/>
       <w:r>
         <w:rPr>
           <w:b/>
           <w:bCs/>
         </w:rPr>
-        <w:t>{{ turno</w:t>
-      </w:r>
-      <w:proofErr w:type="gramEnd"/>
-      <w:r>
-        <w:rPr>
-          <w:b/>
-          <w:bCs/>
-        </w:rPr>
-        <w:t>_</w:t>
-      </w:r>
-      <w:proofErr w:type="gramStart"/>
-      <w:r>
-        <w:rPr>
-          <w:b/>
-          <w:bCs/>
-        </w:rPr>
-        <w:t>3 }</w:t>
-      </w:r>
-      <w:proofErr w:type="gramEnd"/>
-      <w:r>
-        <w:rPr>
-          <w:b/>
-          <w:bCs/>
-        </w:rPr>
-        <w:t>}</w:t>
+        <w:t>***</w:t>
       </w:r>
       <w:r>
         <w:rPr>
@@ -9772,24 +9722,27 @@
             </w:pPr>
             <w:r>
               <w:rPr>
+                <w:rFonts w:ascii="Times New Roman" w:hAnsi="Times New Roman" w:cs="Times New Roman"/>
                 <w:noProof/>
-                <w:lang w:eastAsia="es-MX"/>
+                <w:sz w:val="24"/>
+                <w:szCs w:val="24"/>
+                <w:lang w:val="es-ES" w:eastAsia="es-ES"/>
               </w:rPr>
               <mc:AlternateContent>
                 <mc:Choice Requires="wps">
                   <w:drawing>
-                    <wp:anchor distT="0" distB="0" distL="114300" distR="114300" simplePos="0" relativeHeight="251658243" behindDoc="0" locked="0" layoutInCell="1" allowOverlap="1" wp14:anchorId="29B3FC5C" wp14:editId="1A04EB6A">
+                    <wp:anchor distT="0" distB="0" distL="114300" distR="114300" simplePos="0" relativeHeight="251662339" behindDoc="0" locked="0" layoutInCell="1" allowOverlap="1" wp14:anchorId="55A99FAC" wp14:editId="0B0831E2">
                       <wp:simplePos x="0" y="0"/>
                       <wp:positionH relativeFrom="margin">
                         <wp:align>right</wp:align>
                       </wp:positionH>
                       <wp:positionV relativeFrom="paragraph">
-                        <wp:posOffset>4657</wp:posOffset>
+                        <wp:posOffset>6985</wp:posOffset>
                       </wp:positionV>
-                      <wp:extent cx="3581400" cy="548640"/>
+                      <wp:extent cx="2743200" cy="548640"/>
                       <wp:effectExtent l="0" t="0" r="0" b="3810"/>
                       <wp:wrapNone/>
-                      <wp:docPr id="1448439813" name="Cuadro de texto 4"/>
+                      <wp:docPr id="73310920" name="Cuadro de texto 2"/>
                       <wp:cNvGraphicFramePr/>
                       <a:graphic xmlns:a="http://schemas.openxmlformats.org/drawingml/2006/main">
                         <a:graphicData uri="http://schemas.microsoft.com/office/word/2010/wordprocessingShape">
@@ -9798,7 +9751,7 @@
                             <wps:spPr>
                               <a:xfrm>
                                 <a:off x="0" y="0"/>
-                                <a:ext cx="3581400" cy="548640"/>
+                                <a:ext cx="2743200" cy="548640"/>
                               </a:xfrm>
                               <a:prstGeom prst="rect">
                                 <a:avLst/>
@@ -9814,40 +9767,24 @@
                                   <w:pPr>
                                     <w:spacing w:after="0" w:line="240" w:lineRule="auto"/>
                                     <w:jc w:val="right"/>
-                                    <w:rPr>
-                                      <w:sz w:val="24"/>
-                                      <w:szCs w:val="24"/>
-                                    </w:rPr>
                                   </w:pPr>
                                   <w:proofErr w:type="gramStart"/>
                                   <w:r>
-                                    <w:rPr>
-                                      <w:sz w:val="24"/>
-                                      <w:szCs w:val="24"/>
-                                    </w:rPr>
                                     <w:t xml:space="preserve">{{ </w:t>
                                   </w:r>
                                   <w:proofErr w:type="spellStart"/>
                                   <w:r>
-                                    <w:rPr>
-                                      <w:sz w:val="24"/>
-                                      <w:szCs w:val="24"/>
-                                    </w:rPr>
                                     <w:t>Direccion</w:t>
                                   </w:r>
                                   <w:proofErr w:type="spellEnd"/>
                                   <w:proofErr w:type="gramEnd"/>
                                   <w:r>
-                                    <w:rPr>
-                                      <w:sz w:val="24"/>
-                                      <w:szCs w:val="24"/>
-                                    </w:rPr>
                                     <w:t xml:space="preserve"> }}</w:t>
                                   </w:r>
                                 </w:p>
                               </w:txbxContent>
                             </wps:txbx>
-                            <wps:bodyPr rot="0" spcFirstLastPara="0" vertOverflow="overflow" horzOverflow="overflow" vert="horz" wrap="square" lIns="91440" tIns="45720" rIns="91440" bIns="45720" numCol="1" spcCol="0" rtlCol="0" fromWordArt="0" anchor="t" anchorCtr="0" forceAA="0" compatLnSpc="1">
+                            <wps:bodyPr rot="0" spcFirstLastPara="0" vertOverflow="clip" horzOverflow="clip" vert="horz" wrap="square" lIns="91440" tIns="45720" rIns="91440" bIns="45720" numCol="1" spcCol="0" rtlCol="0" fromWordArt="0" anchor="t" anchorCtr="0" forceAA="0" compatLnSpc="1">
                               <a:prstTxWarp prst="textNoShape">
                                 <a:avLst/>
                               </a:prstTxWarp>
@@ -9867,45 +9804,29 @@
                 </mc:Choice>
                 <mc:Fallback>
                   <w:pict>
-                    <v:shapetype w14:anchorId="29B3FC5C" id="_x0000_t202" coordsize="21600,21600" o:spt="202" path="m,l,21600r21600,l21600,xe">
+                    <v:shapetype w14:anchorId="55A99FAC" id="_x0000_t202" coordsize="21600,21600" o:spt="202" path="m,l,21600r21600,l21600,xe">
                       <v:stroke joinstyle="miter"/>
                       <v:path gradientshapeok="t" o:connecttype="rect"/>
                     </v:shapetype>
-                    <v:shape id="Cuadro de texto 4" o:spid="_x0000_s1026" type="#_x0000_t202" style="position:absolute;margin-left:230.8pt;margin-top:.35pt;width:282pt;height:43.2pt;z-index:251658243;visibility:visible;mso-wrap-style:square;mso-width-percent:0;mso-height-percent:0;mso-wrap-distance-left:9pt;mso-wrap-distance-top:0;mso-wrap-distance-right:9pt;mso-wrap-distance-bottom:0;mso-position-horizontal:right;mso-position-horizontal-relative:margin;mso-position-vertical:absolute;mso-position-vertical-relative:text;mso-width-percent:0;mso-height-percent:0;mso-width-relative:margin;mso-height-relative:margin;v-text-anchor:top" o:gfxdata="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" filled="f" stroked="f" strokeweight=".5pt">
+                    <v:shape id="Cuadro de texto 2" o:spid="_x0000_s1026" type="#_x0000_t202" style="position:absolute;margin-left:164.8pt;margin-top:.55pt;width:3in;height:43.2pt;z-index:251662339;visibility:visible;mso-wrap-style:square;mso-width-percent:0;mso-height-percent:0;mso-wrap-distance-left:9pt;mso-wrap-distance-top:0;mso-wrap-distance-right:9pt;mso-wrap-distance-bottom:0;mso-position-horizontal:right;mso-position-horizontal-relative:margin;mso-position-vertical:absolute;mso-position-vertical-relative:text;mso-width-percent:0;mso-height-percent:0;mso-width-relative:margin;mso-height-relative:margin;v-text-anchor:top" o:gfxdata="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" filled="f" stroked="f" strokeweight=".5pt">
                       <v:textbox>
                         <w:txbxContent>
                           <w:p>
                             <w:pPr>
                               <w:spacing w:after="0" w:line="240" w:lineRule="auto"/>
                               <w:jc w:val="right"/>
-                              <w:rPr>
-                                <w:sz w:val="24"/>
-                                <w:szCs w:val="24"/>
-                              </w:rPr>
                             </w:pPr>
                             <w:proofErr w:type="gramStart"/>
                             <w:r>
-                              <w:rPr>
-                                <w:sz w:val="24"/>
-                                <w:szCs w:val="24"/>
-                              </w:rPr>
                               <w:t xml:space="preserve">{{ </w:t>
                             </w:r>
                             <w:proofErr w:type="spellStart"/>
                             <w:r>
-                              <w:rPr>
-                                <w:sz w:val="24"/>
-                                <w:szCs w:val="24"/>
-                              </w:rPr>
                               <w:t>Direccion</w:t>
                             </w:r>
                             <w:proofErr w:type="spellEnd"/>
                             <w:proofErr w:type="gramEnd"/>
                             <w:r>
-                              <w:rPr>
-                                <w:sz w:val="24"/>
-                                <w:szCs w:val="24"/>
-                              </w:rPr>
                               <w:t xml:space="preserve"> }}</w:t>
                             </w:r>
                           </w:p>

</xml_diff>